<commit_message>
Update project documentation and comments
</commit_message>
<xml_diff>
--- a/DOC/要件定義書_壁紙積算システム.docx
+++ b/DOC/要件定義書_壁紙積算システム.docx
@@ -207,6 +207,48 @@
           </w:p>
         </w:tc>
       </w:tr>
+      <w:tr>
+        <w:tc>
+          <w:tcPr>
+            <w:tcW w:type="dxa" w:w="2160"/>
+          </w:tcPr>
+          <w:p>
+            <w:r>
+              <w:t>1.1</w:t>
+            </w:r>
+          </w:p>
+        </w:tc>
+        <w:tc>
+          <w:tcPr>
+            <w:tcW w:type="dxa" w:w="2160"/>
+          </w:tcPr>
+          <w:p>
+            <w:r>
+              <w:t>2026/06/15</w:t>
+            </w:r>
+          </w:p>
+        </w:tc>
+        <w:tc>
+          <w:tcPr>
+            <w:tcW w:type="dxa" w:w="2160"/>
+          </w:tcPr>
+          <w:p>
+            <w:r>
+              <w:t>Codex</w:t>
+            </w:r>
+          </w:p>
+        </w:tc>
+        <w:tc>
+          <w:tcPr>
+            <w:tcW w:type="dxa" w:w="2160"/>
+          </w:tcPr>
+          <w:p>
+            <w:r>
+              <w:t>現行ソースに合わせ、表ページ指定、解析状態管理、手動部屋追加、集計対象外、CSV/DB項目を改定</w:t>
+            </w:r>
+          </w:p>
+        </w:tc>
+      </w:tr>
     </w:tbl>
     <w:p>
       <w:pPr>
@@ -328,7 +370,7 @@
     <w:p>
       <w:pPr/>
       <w:r>
-        <w:t>案件一覧表示、新規積算作成、PDF図面登録、図面ページ指定、PDF AI読取、部屋データ作成、壁紙別集計、部屋別明細、面別壁紙設定、採用見積方式選択、壁紙設定保存、PDF再読込、PDF表示、CSV出力、壁紙マスタ管理、初期値設定管理、ユーザー・権限管理をシステム化対象とする。</w:t>
+        <w:t>案件一覧表示、新規積算作成、PDF図面登録、図面ページ指定、表ページ指定、PDF AI読取、部屋データ作成、抽出失敗部屋の補完、手動部屋追加、集計対象外設定、壁紙別集計、部屋別明細、面別壁紙設定、採用見積方式選択、壁紙設定保存、PDF再読込、PDF表示、CSV出力、壁紙マスタ管理、初期値設定管理、ユーザー・権限管理をシステム化対象とする。</w:t>
       </w:r>
     </w:p>
     <w:p>
@@ -358,6 +400,8 @@
         <w:br/>
         <w:t>・図面ページ指定機能</w:t>
         <w:br/>
+        <w:t>・表ページ指定機能</w:t>
+        <w:br/>
         <w:t>・積算詳細表示機能</w:t>
         <w:br/>
         <w:t>・壁紙別集計機能</w:t>
@@ -366,6 +410,10 @@
         <w:br/>
         <w:t>・面別壁紙設定保存機能</w:t>
         <w:br/>
+        <w:t>・手動部屋追加機能</w:t>
+        <w:br/>
+        <w:t>・集計対象外設定機能</w:t>
+        <w:br/>
         <w:t>・PDF再読込機能</w:t>
         <w:br/>
         <w:t>・CSV出力機能</w:t>
@@ -394,6 +442,8 @@
         <w:br/>
         <w:t>・積算詳細画面</w:t>
         <w:br/>
+        <w:t>・積算編集画面</w:t>
+        <w:br/>
         <w:t>・PDF図面表示</w:t>
         <w:br/>
         <w:t>・管理画面</w:t>
@@ -418,7 +468,7 @@
     <w:p>
       <w:pPr/>
       <w:r>
-        <w:t>案件情報、図面PDF、図面ページ指定、部屋情報、壁面・天井ごとの面積と開口部、面別壁紙情報、採用見積方式、壁紙マスタ、初期値設定、ユーザー情報、グループ情報、権限情報、管理画面操作ログ、セッション情報を管理する。詳細は別紙『DB設計 テーブル定義書_壁紙積算システム.xlsx』を参照すること。</w:t>
+        <w:t>案件情報、図面PDF、図面ページ指定、表ページ指定、解析ステータス・解析モデル・解析エラー・計算時間、部屋情報、部屋追加区分、集計対象外、壁面・天井ごとの面積と開口部、面別壁紙情報、採用見積方式、壁紙マスタ、初期値設定、ユーザー情報、グループ情報、権限情報、管理画面操作ログ、セッション情報を管理する。詳細は別紙『DB設計 テーブル定義書_壁紙積算システム.xlsx』を参照すること。</w:t>
       </w:r>
     </w:p>
     <w:p>

</xml_diff>